<commit_message>
Actualizando Modulo 2 Unidad 4
</commit_message>
<xml_diff>
--- a/docs/Actividades Modulo 2 - Unidad 5.docx
+++ b/docs/Actividades Modulo 2 - Unidad 5.docx
@@ -42,6 +42,53 @@
           <w:lang w:val="es-MX"/>
         </w:rPr>
       </w:pPr>
+      <w:r>
+        <w:rPr>
+          <w:noProof/>
+          <w:lang w:val="es-MX"/>
+        </w:rPr>
+        <w:drawing>
+          <wp:inline distT="0" distB="0" distL="0" distR="0" wp14:anchorId="76DE7DF0" wp14:editId="01FA0531">
+            <wp:extent cx="5943600" cy="3569970"/>
+            <wp:effectExtent l="0" t="0" r="0" b="0"/>
+            <wp:docPr id="1954020963" name="Picture 1"/>
+            <wp:cNvGraphicFramePr>
+              <a:graphicFrameLocks xmlns:a="http://schemas.openxmlformats.org/drawingml/2006/main" noChangeAspect="1"/>
+            </wp:cNvGraphicFramePr>
+            <a:graphic xmlns:a="http://schemas.openxmlformats.org/drawingml/2006/main">
+              <a:graphicData uri="http://schemas.openxmlformats.org/drawingml/2006/picture">
+                <pic:pic xmlns:pic="http://schemas.openxmlformats.org/drawingml/2006/picture">
+                  <pic:nvPicPr>
+                    <pic:cNvPr id="1954020963" name="Picture 1954020963"/>
+                    <pic:cNvPicPr/>
+                  </pic:nvPicPr>
+                  <pic:blipFill>
+                    <a:blip r:embed="rId4" cstate="print">
+                      <a:extLst>
+                        <a:ext uri="{28A0092B-C50C-407E-A947-70E740481C1C}">
+                          <a14:useLocalDpi xmlns:a14="http://schemas.microsoft.com/office/drawing/2010/main" val="0"/>
+                        </a:ext>
+                      </a:extLst>
+                    </a:blip>
+                    <a:stretch>
+                      <a:fillRect/>
+                    </a:stretch>
+                  </pic:blipFill>
+                  <pic:spPr>
+                    <a:xfrm>
+                      <a:off x="0" y="0"/>
+                      <a:ext cx="5943600" cy="3569970"/>
+                    </a:xfrm>
+                    <a:prstGeom prst="rect">
+                      <a:avLst/>
+                    </a:prstGeom>
+                  </pic:spPr>
+                </pic:pic>
+              </a:graphicData>
+            </a:graphic>
+          </wp:inline>
+        </w:drawing>
+      </w:r>
     </w:p>
     <w:sectPr>
       <w:pgSz w:w="12240" w:h="15840"/>

</xml_diff>

<commit_message>
Modulo 2 Unidad 4
</commit_message>
<xml_diff>
--- a/docs/Actividades Modulo 2 - Unidad 5.docx
+++ b/docs/Actividades Modulo 2 - Unidad 5.docx
@@ -48,7 +48,7 @@
           <w:lang w:val="es-MX"/>
         </w:rPr>
         <w:drawing>
-          <wp:inline distT="0" distB="0" distL="0" distR="0" wp14:anchorId="76DE7DF0" wp14:editId="01FA0531">
+          <wp:inline distT="0" distB="0" distL="0" distR="0" wp14:anchorId="76DE7DF0" wp14:editId="5BE7AB91">
             <wp:extent cx="5943600" cy="3569970"/>
             <wp:effectExtent l="0" t="0" r="0" b="0"/>
             <wp:docPr id="1954020963" name="Picture 1"/>
@@ -89,6 +89,68 @@
           </wp:inline>
         </w:drawing>
       </w:r>
+    </w:p>
+    <w:p>
+      <w:pPr>
+        <w:rPr>
+          <w:lang w:val="es-MX"/>
+        </w:rPr>
+      </w:pPr>
+      <w:r>
+        <w:rPr>
+          <w:noProof/>
+        </w:rPr>
+        <w:lastRenderedPageBreak/>
+        <w:drawing>
+          <wp:inline distT="0" distB="0" distL="0" distR="0" wp14:anchorId="255E8767" wp14:editId="342053E2">
+            <wp:extent cx="5943600" cy="4123055"/>
+            <wp:effectExtent l="0" t="0" r="0" b="0"/>
+            <wp:docPr id="128970796" name="Picture 1"/>
+            <wp:cNvGraphicFramePr>
+              <a:graphicFrameLocks xmlns:a="http://schemas.openxmlformats.org/drawingml/2006/main" noChangeAspect="1"/>
+            </wp:cNvGraphicFramePr>
+            <a:graphic xmlns:a="http://schemas.openxmlformats.org/drawingml/2006/main">
+              <a:graphicData uri="http://schemas.openxmlformats.org/drawingml/2006/picture">
+                <pic:pic xmlns:pic="http://schemas.openxmlformats.org/drawingml/2006/picture">
+                  <pic:nvPicPr>
+                    <pic:cNvPr id="128970796" name=""/>
+                    <pic:cNvPicPr/>
+                  </pic:nvPicPr>
+                  <pic:blipFill>
+                    <a:blip r:embed="rId5"/>
+                    <a:stretch>
+                      <a:fillRect/>
+                    </a:stretch>
+                  </pic:blipFill>
+                  <pic:spPr>
+                    <a:xfrm>
+                      <a:off x="0" y="0"/>
+                      <a:ext cx="5943600" cy="4123055"/>
+                    </a:xfrm>
+                    <a:prstGeom prst="rect">
+                      <a:avLst/>
+                    </a:prstGeom>
+                  </pic:spPr>
+                </pic:pic>
+              </a:graphicData>
+            </a:graphic>
+          </wp:inline>
+        </w:drawing>
+      </w:r>
+    </w:p>
+    <w:p>
+      <w:pPr>
+        <w:rPr>
+          <w:lang w:val="es-MX"/>
+        </w:rPr>
+      </w:pPr>
+    </w:p>
+    <w:p>
+      <w:pPr>
+        <w:rPr>
+          <w:lang w:val="es-MX"/>
+        </w:rPr>
+      </w:pPr>
     </w:p>
     <w:sectPr>
       <w:pgSz w:w="12240" w:h="15840"/>
@@ -702,6 +764,7 @@
   <w:style w:type="character" w:default="1" w:styleId="DefaultParagraphFont">
     <w:name w:val="Default Paragraph Font"/>
     <w:uiPriority w:val="1"/>
+    <w:semiHidden/>
     <w:unhideWhenUsed/>
   </w:style>
   <w:style w:type="table" w:default="1" w:styleId="TableNormal">

</xml_diff>

<commit_message>
Agregando el archivo de validaciones
</commit_message>
<xml_diff>
--- a/docs/Actividades Modulo 2 - Unidad 5.docx
+++ b/docs/Actividades Modulo 2 - Unidad 5.docx
@@ -48,7 +48,7 @@
           <w:lang w:val="es-MX"/>
         </w:rPr>
         <w:drawing>
-          <wp:inline distT="0" distB="0" distL="0" distR="0" wp14:anchorId="76DE7DF0" wp14:editId="5BE7AB91">
+          <wp:inline distT="0" distB="0" distL="0" distR="0" wp14:anchorId="76DE7DF0" wp14:editId="2D46310F">
             <wp:extent cx="5943600" cy="3569970"/>
             <wp:effectExtent l="0" t="0" r="0" b="0"/>
             <wp:docPr id="1954020963" name="Picture 1"/>
@@ -151,6 +151,150 @@
           <w:lang w:val="es-MX"/>
         </w:rPr>
       </w:pPr>
+      <w:r>
+        <w:rPr>
+          <w:noProof/>
+        </w:rPr>
+        <w:lastRenderedPageBreak/>
+        <w:drawing>
+          <wp:inline distT="0" distB="0" distL="0" distR="0" wp14:anchorId="39B7700B" wp14:editId="60D26BFC">
+            <wp:extent cx="5943600" cy="4806950"/>
+            <wp:effectExtent l="0" t="0" r="0" b="0"/>
+            <wp:docPr id="1648066243" name="Picture 1"/>
+            <wp:cNvGraphicFramePr>
+              <a:graphicFrameLocks xmlns:a="http://schemas.openxmlformats.org/drawingml/2006/main" noChangeAspect="1"/>
+            </wp:cNvGraphicFramePr>
+            <a:graphic xmlns:a="http://schemas.openxmlformats.org/drawingml/2006/main">
+              <a:graphicData uri="http://schemas.openxmlformats.org/drawingml/2006/picture">
+                <pic:pic xmlns:pic="http://schemas.openxmlformats.org/drawingml/2006/picture">
+                  <pic:nvPicPr>
+                    <pic:cNvPr id="1648066243" name=""/>
+                    <pic:cNvPicPr/>
+                  </pic:nvPicPr>
+                  <pic:blipFill>
+                    <a:blip r:embed="rId6"/>
+                    <a:stretch>
+                      <a:fillRect/>
+                    </a:stretch>
+                  </pic:blipFill>
+                  <pic:spPr>
+                    <a:xfrm>
+                      <a:off x="0" y="0"/>
+                      <a:ext cx="5943600" cy="4806950"/>
+                    </a:xfrm>
+                    <a:prstGeom prst="rect">
+                      <a:avLst/>
+                    </a:prstGeom>
+                  </pic:spPr>
+                </pic:pic>
+              </a:graphicData>
+            </a:graphic>
+          </wp:inline>
+        </w:drawing>
+      </w:r>
+    </w:p>
+    <w:p>
+      <w:pPr>
+        <w:rPr>
+          <w:lang w:val="es-MX"/>
+        </w:rPr>
+      </w:pPr>
+    </w:p>
+    <w:p>
+      <w:pPr>
+        <w:rPr>
+          <w:lang w:val="es-MX"/>
+        </w:rPr>
+      </w:pPr>
+      <w:r>
+        <w:rPr>
+          <w:noProof/>
+        </w:rPr>
+        <w:lastRenderedPageBreak/>
+        <w:drawing>
+          <wp:inline distT="0" distB="0" distL="0" distR="0" wp14:anchorId="5EF7E29E" wp14:editId="1A403BE3">
+            <wp:extent cx="5943600" cy="4509135"/>
+            <wp:effectExtent l="0" t="0" r="0" b="5715"/>
+            <wp:docPr id="1903347372" name="Picture 1"/>
+            <wp:cNvGraphicFramePr>
+              <a:graphicFrameLocks xmlns:a="http://schemas.openxmlformats.org/drawingml/2006/main" noChangeAspect="1"/>
+            </wp:cNvGraphicFramePr>
+            <a:graphic xmlns:a="http://schemas.openxmlformats.org/drawingml/2006/main">
+              <a:graphicData uri="http://schemas.openxmlformats.org/drawingml/2006/picture">
+                <pic:pic xmlns:pic="http://schemas.openxmlformats.org/drawingml/2006/picture">
+                  <pic:nvPicPr>
+                    <pic:cNvPr id="1903347372" name=""/>
+                    <pic:cNvPicPr/>
+                  </pic:nvPicPr>
+                  <pic:blipFill>
+                    <a:blip r:embed="rId7"/>
+                    <a:stretch>
+                      <a:fillRect/>
+                    </a:stretch>
+                  </pic:blipFill>
+                  <pic:spPr>
+                    <a:xfrm>
+                      <a:off x="0" y="0"/>
+                      <a:ext cx="5943600" cy="4509135"/>
+                    </a:xfrm>
+                    <a:prstGeom prst="rect">
+                      <a:avLst/>
+                    </a:prstGeom>
+                  </pic:spPr>
+                </pic:pic>
+              </a:graphicData>
+            </a:graphic>
+          </wp:inline>
+        </w:drawing>
+      </w:r>
+    </w:p>
+    <w:p>
+      <w:pPr>
+        <w:rPr>
+          <w:lang w:val="es-MX"/>
+        </w:rPr>
+      </w:pPr>
+      <w:r>
+        <w:rPr>
+          <w:noProof/>
+        </w:rPr>
+        <w:lastRenderedPageBreak/>
+        <w:drawing>
+          <wp:inline distT="0" distB="0" distL="0" distR="0" wp14:anchorId="0DE688DD" wp14:editId="7EC70221">
+            <wp:extent cx="5943600" cy="4495800"/>
+            <wp:effectExtent l="0" t="0" r="0" b="0"/>
+            <wp:docPr id="742600020" name="Picture 1"/>
+            <wp:cNvGraphicFramePr>
+              <a:graphicFrameLocks xmlns:a="http://schemas.openxmlformats.org/drawingml/2006/main" noChangeAspect="1"/>
+            </wp:cNvGraphicFramePr>
+            <a:graphic xmlns:a="http://schemas.openxmlformats.org/drawingml/2006/main">
+              <a:graphicData uri="http://schemas.openxmlformats.org/drawingml/2006/picture">
+                <pic:pic xmlns:pic="http://schemas.openxmlformats.org/drawingml/2006/picture">
+                  <pic:nvPicPr>
+                    <pic:cNvPr id="742600020" name=""/>
+                    <pic:cNvPicPr/>
+                  </pic:nvPicPr>
+                  <pic:blipFill>
+                    <a:blip r:embed="rId8"/>
+                    <a:stretch>
+                      <a:fillRect/>
+                    </a:stretch>
+                  </pic:blipFill>
+                  <pic:spPr>
+                    <a:xfrm>
+                      <a:off x="0" y="0"/>
+                      <a:ext cx="5943600" cy="4495800"/>
+                    </a:xfrm>
+                    <a:prstGeom prst="rect">
+                      <a:avLst/>
+                    </a:prstGeom>
+                  </pic:spPr>
+                </pic:pic>
+              </a:graphicData>
+            </a:graphic>
+          </wp:inline>
+        </w:drawing>
+      </w:r>
     </w:p>
     <w:sectPr>
       <w:pgSz w:w="12240" w:h="15840"/>

</xml_diff>